<commit_message>
Updated draft DID session
</commit_message>
<xml_diff>
--- a/Module_2_Oct_2026/Oct13_session1_facilitator_guide.docx
+++ b/Module_2_Oct_2026/Oct13_session1_facilitator_guide.docx
@@ -257,7 +257,7 @@
                 <w:sz w:val="20"/>
                 <w:szCs w:val="20"/>
               </w:rPr>
-              <w:t xml:space="preserve">Opening — what this session gives you</w:t>
+              <w:t>Opening: what this session gives you</w:t>
             </w:r>
           </w:p>
         </w:tc>
@@ -697,7 +697,7 @@
                 <w:sz w:val="20"/>
                 <w:szCs w:val="20"/>
               </w:rPr>
-              <w:t xml:space="preserve">Which row is the effect — and which two are not</w:t>
+              <w:t>Which row is the effect, and which two are not</w:t>
             </w:r>
           </w:p>
         </w:tc>
@@ -1144,7 +1144,7 @@
           <w:sz w:val="21"/>
           <w:szCs w:val="21"/>
         </w:rPr>
-        <w:t xml:space="preserve">Printed handout 1 — the four-numbers card (one per participant)</w:t>
+        <w:t>Printed handout 1: the four-numbers card (one per participant)</w:t>
       </w:r>
     </w:p>
     <w:p>
@@ -1162,7 +1162,7 @@
           <w:sz w:val="21"/>
           <w:szCs w:val="21"/>
         </w:rPr>
-        <w:t xml:space="preserve">Printed handout 2 — the AI answer, for mark-up (one per pair)</w:t>
+        <w:t>Printed handout 2: the AI answer, for mark-up (one per pair)</w:t>
       </w:r>
     </w:p>
     <w:p>
@@ -1180,7 +1180,7 @@
           <w:sz w:val="21"/>
           <w:szCs w:val="21"/>
         </w:rPr>
-        <w:t xml:space="preserve">Printed handout 3 — the two prompt cards (one per group)</w:t>
+        <w:t>Printed handout 3: the two prompt cards (one per group)</w:t>
       </w:r>
     </w:p>
     <w:p>
@@ -1198,7 +1198,7 @@
           <w:sz w:val="21"/>
           <w:szCs w:val="21"/>
         </w:rPr>
-        <w:t xml:space="preserve">Printed handout 4 — the three questions, take-away card (one per participant)</w:t>
+        <w:t>Printed handout 4: the three questions, take-away card (one per participant)</w:t>
       </w:r>
     </w:p>
     <w:p>
@@ -1287,7 +1287,7 @@
           <w:sz w:val="21"/>
           <w:szCs w:val="21"/>
         </w:rPr>
-        <w:t xml:space="preserve">Check the projector renders the charts legibly from the back — the confidence-interval slide is the smallest text in the deck.</w:t>
+        <w:t>Check the projector renders the charts legibly from the back: the confidence-interval slide is the smallest text in the deck.</w:t>
       </w:r>
     </w:p>
     <w:tbl>
@@ -1386,7 +1386,7 @@
           <w:sz w:val="21"/>
           <w:szCs w:val="21"/>
         </w:rPr>
-        <w:t xml:space="preserve">0:03 – 0:10  ·  Slides: “The GreenWaste Program” → “Who is actually in this evaluation?”</w:t>
+        <w:t>0:03 – 0:10  ·  Slides: “The GreenWaste Program” → “Who is part of this evaluation?”</w:t>
       </w:r>
     </w:p>
     <w:p>
@@ -1510,7 +1510,7 @@
           <w:sz w:val="21"/>
           <w:szCs w:val="21"/>
         </w:rPr>
-        <w:t xml:space="preserve">“Who sets a number like that in your organisation — and does it get set before or after the results arrive?”</w:t>
+        <w:t>“Who sets a number like that in your organisation, and does it get set before or after the results arrive?”</w:t>
       </w:r>
     </w:p>
     <w:p>
@@ -1554,7 +1554,7 @@
           <w:sz w:val="21"/>
           <w:szCs w:val="21"/>
         </w:rPr>
-        <w:t xml:space="preserve">Plant the seed and move on. Say only: “keep an eye on the comparison group — we will come back to exactly who those businesses are.” Do not explain it yet. The reveal at 1:01 is much stronger if they have been mildly curious for an hour.</w:t>
+        <w:t>Plant the seed and move on. Say only: “keep an eye on the comparison group, we will come back to exactly who those businesses are.” Do not explain it yet. The reveal at 1:01 is much stronger if they have been mildly curious for an hour.</w:t>
       </w:r>
     </w:p>
     <w:p>
@@ -1645,7 +1645,7 @@
                 <w:sz w:val="21"/>
                 <w:szCs w:val="21"/>
               </w:rPr>
-              <w:t xml:space="preserve">“Here is what happened to the businesses that were offered the programme. Costs went from 1,449 dirhams to 784. That is a fall of 665 dirhams — a drop of forty-six per cent.”</w:t>
+              <w:t>“Here is what happened to the businesses that were offered the programme. Costs went from 1,449 dirhams to 784. That is a fall of 665 dirhams, a drop of forty-six per cent.”</w:t>
             </w:r>
           </w:p>
           <w:p>
@@ -1680,7 +1680,7 @@
           <w:sz w:val="21"/>
           <w:szCs w:val="21"/>
         </w:rPr>
-        <w:t xml:space="preserve">The vote — do not skip this</w:t>
+        <w:t>The vote: do not skip this</w:t>
       </w:r>
     </w:p>
     <w:p>
@@ -1693,7 +1693,7 @@
           <w:sz w:val="21"/>
           <w:szCs w:val="21"/>
         </w:rPr>
-        <w:t xml:space="preserve">Put the question up, count the hands, and write the number on the flipchart. Ask two people why. Do not move on until the room has committed — the reveal only works against a stated position.</w:t>
+        <w:t>Put the question up, count the hands, and write the number on the flipchart. Ask two people why. Do not move on until the room has committed: the reveal only works against a stated position.</w:t>
       </w:r>
     </w:p>
     <w:tbl>
@@ -1751,7 +1751,7 @@
                 <w:sz w:val="21"/>
                 <w:szCs w:val="21"/>
               </w:rPr>
-              <w:t xml:space="preserve">Name them and say you are about to prove them right. Do not treat it as spoiling the exercise — it is the best possible outcome, and the rest of the room now has a peer rather than a trainer making the argument.</w:t>
+              <w:t>Name them and say you are about to prove them right. Do not treat it as spoiling the exercise: it is the best possible outcome, and the rest of the room now has a peer rather than a trainer making the argument.</w:t>
             </w:r>
           </w:p>
         </w:tc>
@@ -1842,7 +1842,7 @@
                 <w:sz w:val="21"/>
                 <w:szCs w:val="21"/>
               </w:rPr>
-              <w:t xml:space="preserve">“Costs were going up for everybody — volumes, prices, regulation. So part of that 665 is the programme, and part of it is just the world getting more expensive.”</w:t>
+              <w:t>“Costs were going up for everybody: volumes, prices, regulation. So part of that 665 is the programme, and part of it is just the world getting more expensive.”</w:t>
             </w:r>
           </w:p>
           <w:p>
@@ -1857,7 +1857,7 @@
                 <w:sz w:val="21"/>
                 <w:szCs w:val="21"/>
               </w:rPr>
-              <w:t xml:space="preserve">“Now look at the direction this pushes us. The comparison group went up by 151. So the honest estimate is not smaller than 665 — it is larger. 816. The programme had to swim against the tide, and it gets credit for that.”</w:t>
+              <w:t>“Now look at the direction this pushes us. The comparison group went up by 151. So the honest estimate is not smaller than 665: it is larger. 816. The programme had to swim against the tide, and it gets credit for that.”</w:t>
             </w:r>
           </w:p>
         </w:tc>
@@ -1918,7 +1918,7 @@
                 <w:sz w:val="21"/>
                 <w:szCs w:val="21"/>
               </w:rPr>
-              <w:t xml:space="preserve">People assume that “adjusting for a comparison group” always shrinks a result. Here it grows it. Say explicitly: a comparison group is not a haircut, it is a correction — and it can go either way.</w:t>
+              <w:t>People assume that “adjusting for a comparison group” always shrinks a result. Here it grows it. Say explicitly: a comparison group is not a haircut, it is a correction, and it can go either way.</w:t>
             </w:r>
           </w:p>
         </w:tc>
@@ -2053,6 +2053,28 @@
     <w:p>
       <w:pPr>
         <w:pStyle w:val="Heading3"/>
+      </w:pPr>
+      <w:r>
+        <w:rPr>
+          <w:rFonts w:ascii="Calibri" w:hAnsi="Calibri"/>
+          <w:b/>
+          <w:sz w:val="21"/>
+        </w:rPr>
+        <w:t>Why this method</w:t>
+      </w:r>
+    </w:p>
+    <w:p>
+      <w:r>
+        <w:rPr>
+          <w:rFonts w:ascii="Calibri" w:hAnsi="Calibri"/>
+          <w:sz w:val="21"/>
+        </w:rPr>
+        <w:t>After the one-sentence definition, two short slides situate the method. “When is difference-in-differences the right tool?” gives the conditions: use it when you could not randomise but you do have before-and-after data on a treated group and a comparison group. “Why DiD and not something simpler?” then makes the case against the alternatives: a plain before-and-after credits the programme with the time trend, and a one-time comparison of the two groups credits it with the baseline gap. Those are exactly the two coefficients they meet as Trap 1 and Trap 2 in Section 4, so name them here. Together they set up the closing question, ‘why this method rather than another?’</w:t>
+      </w:r>
+    </w:p>
+    <w:p>
+      <w:pPr>
+        <w:pStyle w:val="Heading3"/>
         <w:spacing w:after="80" w:before="180"/>
       </w:pPr>
       <w:r>
@@ -2100,7 +2122,7 @@
           <w:sz w:val="21"/>
           <w:szCs w:val="21"/>
         </w:rPr>
-        <w:t xml:space="preserve">Give them ninety seconds, and keep it genuinely silent — do not narrate over it.</w:t>
+        <w:t>Give them ninety seconds, and keep it genuinely silent: do not narrate over it.</w:t>
       </w:r>
     </w:p>
     <w:p>
@@ -2658,7 +2680,7 @@
           <w:sz w:val="21"/>
           <w:szCs w:val="21"/>
         </w:rPr>
-        <w:t xml:space="preserve">Point at the dotted line and name it properly: this is the invented number at the heart of every impact evaluation. It is never observed. Everything rests on how believable it is — which is exactly what Section 5 interrogates.</w:t>
+        <w:t>Point at the dotted line and name it properly: this is the invented number at the heart of every impact evaluation. It is never observed. Everything rests on how believable it is, which is exactly what Section 5 interrogates.</w:t>
       </w:r>
     </w:p>
     <w:p>
@@ -2704,7 +2726,7 @@
           <w:sz w:val="21"/>
           <w:szCs w:val="21"/>
         </w:rPr>
-        <w:t xml:space="preserve">Take a vote across the three numbers before explaining any of them. Many will pick “enrolled” because it is large and has the word enrolled in it. Let them fall into it — the correction is what they will remember.</w:t>
+        <w:t>Take a vote across the three numbers before explaining any of them. Many will pick “enrolled” because it is large and has the word enrolled in it. Let them fall into it: the correction is what they will remember.</w:t>
       </w:r>
     </w:p>
     <w:tbl>
@@ -2953,7 +2975,7 @@
                 <w:sz w:val="20"/>
                 <w:szCs w:val="20"/>
               </w:rPr>
-              <w:t xml:space="preserve">The time trend — what happened anyway. The thing DiD strips out.</w:t>
+              <w:t>The time trend: what happened anyway. The thing DiD strips out.</w:t>
             </w:r>
           </w:p>
         </w:tc>
@@ -3200,7 +3222,7 @@
           <w:sz w:val="21"/>
           <w:szCs w:val="21"/>
         </w:rPr>
-        <w:t xml:space="preserve">Reframe it for decision-makers. The useful question is not “is the interval narrow?” but “does my decision change depending on where in this range the truth sits?” Here the entire interval — −879 to −753 — sits below the bar, so the imprecision does not change the call at all.</w:t>
+        <w:t>Reframe it for decision-makers. The useful question is not “is the interval narrow?” but “does my decision change depending on where in this range the truth sits?” Here the entire interval, −879 to −753, sits below the bar, so the imprecision does not change the call at all.</w:t>
       </w:r>
     </w:p>
     <w:tbl>
@@ -3273,7 +3295,7 @@
                 <w:sz w:val="21"/>
                 <w:szCs w:val="21"/>
               </w:rPr>
-              <w:t xml:space="preserve">Flag that this returns in the AI exercise — because AI conflates them almost every time.</w:t>
+              <w:t>Flag that this returns in the AI exercise, because AI conflates them almost every time.</w:t>
             </w:r>
           </w:p>
         </w:tc>
@@ -3362,7 +3384,7 @@
           <w:sz w:val="21"/>
           <w:szCs w:val="21"/>
         </w:rPr>
-        <w:t xml:space="preserve">A — moving in parallel. The assumption holds; the comparison is fair.</w:t>
+        <w:t>A: moving in parallel. The assumption holds; the comparison is fair.</w:t>
       </w:r>
     </w:p>
     <w:p>
@@ -3380,7 +3402,7 @@
           <w:sz w:val="21"/>
           <w:szCs w:val="21"/>
         </w:rPr>
-        <w:t xml:space="preserve">B — already diverging. The gap was widening anyway, so DiD will overstate the effect.</w:t>
+        <w:t>B: already diverging. The gap was widening anyway, so DiD will overstate the effect.</w:t>
       </w:r>
     </w:p>
     <w:p>
@@ -3398,7 +3420,7 @@
           <w:sz w:val="21"/>
           <w:szCs w:val="21"/>
         </w:rPr>
-        <w:t xml:space="preserve">C — already converging. The gap was closing anyway, so DiD will understate it.</w:t>
+        <w:t>C: already converging. The gap was closing anyway, so DiD will understate it.</w:t>
       </w:r>
     </w:p>
     <w:p>
@@ -3412,7 +3434,7 @@
           <w:sz w:val="21"/>
           <w:szCs w:val="21"/>
         </w:rPr>
-        <w:t xml:space="preserve">If someone spots that B and C bias in opposite directions, draw it out — it is a genuinely sophisticated observation and worth the class time.</w:t>
+        <w:t>If someone spots that B and C bias in opposite directions, draw it out: it is a genuinely sophisticated observation and worth the class time.</w:t>
       </w:r>
     </w:p>
     <w:p>
@@ -3487,7 +3509,7 @@
                 <w:sz w:val="21"/>
                 <w:szCs w:val="21"/>
               </w:rPr>
-              <w:t xml:space="preserve">“Now — were our two groups moving in parallel before the programme? Here is the problem. We measured twice: once before, once after. To check whether the groups were already drifting apart, you need at least two observations before the programme started. We have one.”</w:t>
+              <w:t>“Now, were our two groups moving in parallel before the programme? Here is the problem. We measured twice: once before, once after. To check whether the groups were already drifting apart, you need at least two observations before the programme started. We have one.”</w:t>
             </w:r>
           </w:p>
           <w:p>
@@ -3502,7 +3524,7 @@
                 <w:sz w:val="21"/>
                 <w:szCs w:val="21"/>
               </w:rPr>
-              <w:t xml:space="preserve">“So the parallel trends assumption cannot be tested with this data. Not ‘was not tested’ — cannot be. And I want to be clear that this is not a badly designed evaluation. This is the normal situation for most evaluations you will ever commission.”</w:t>
+              <w:t>“So the parallel trends assumption cannot be tested with this data. Not ‘was not tested’: cannot be. And I want to be clear that this is not a badly designed evaluation. This is the normal situation for most evaluations you will ever commission.”</w:t>
             </w:r>
           </w:p>
         </w:tc>
@@ -3522,7 +3544,7 @@
           <w:sz w:val="21"/>
           <w:szCs w:val="21"/>
         </w:rPr>
-        <w:t xml:space="preserve">The payoff — who the comparison group really is</w:t>
+        <w:t>The payoff: who the comparison group really is</w:t>
       </w:r>
     </w:p>
     <w:p>
@@ -3535,7 +3557,7 @@
           <w:sz w:val="21"/>
           <w:szCs w:val="21"/>
         </w:rPr>
-        <w:t xml:space="preserve">This is the seed from Section 1. Let the histogram do the work: two blocks of colour that never touch. Eligibility was decided by an efficiency score with a cut-off at 58, so the comparison group is not “similar firms that happened to miss out” — it is, by construction, the better-scoring half of the market.</w:t>
+        <w:t>This is the seed from Section 1. Let the histogram do the work: two blocks of colour that never touch. Eligibility was decided by an efficiency score with a cut-off at 58, so the comparison group is not “similar firms that happened to miss out”: it is, by construction, the better-scoring half of the market.</w:t>
       </w:r>
     </w:p>
     <w:tbl>
@@ -3624,7 +3646,7 @@
           <w:sz w:val="21"/>
           <w:szCs w:val="21"/>
         </w:rPr>
-        <w:t xml:space="preserve">Then land the five questions. Note that question 1 — “how was the comparison group chosen?” — would have caught this problem, and requires no statistics whatsoever.</w:t>
+        <w:t>Then land the five questions. Note that question 1, “how was the comparison group chosen?”, would have caught this problem, and requires no statistics whatsoever.</w:t>
       </w:r>
     </w:p>
     <w:p>
@@ -3974,7 +3996,7 @@
                 <w:sz w:val="20"/>
                 <w:szCs w:val="20"/>
               </w:rPr>
-              <w:t xml:space="preserve">It has learned that competent DiD write-ups mention a pre-trends check, so it produces the sentence that belongs in a good report — whether or not the check happened. Groups almost never find this one. Flag it as the most dangerous.</w:t>
+              <w:t>It has learned that competent DiD write-ups mention a pre-trends check, so it produces the sentence that belongs in a good report, whether or not the check happened. Groups almost never find this one. Flag it as the most dangerous.</w:t>
             </w:r>
           </w:p>
         </w:tc>
@@ -4247,7 +4269,7 @@
                 <w:sz w:val="17"/>
                 <w:szCs w:val="17"/>
               </w:rPr>
-              <w:t xml:space="preserve">THE META-POINT — DO NOT LET THIS GO BY</w:t>
+              <w:t>THE META-POINT: DO NOT LET THIS GO BY</w:t>
             </w:r>
           </w:p>
           <w:p>
@@ -4310,7 +4332,7 @@
           <w:sz w:val="21"/>
           <w:szCs w:val="21"/>
         </w:rPr>
-        <w:t xml:space="preserve">Walk through what each element does. The highest-leverage single sentence is “ask me any questions you need before answering” — it converts the model from a guesser into an interviewer. The second is stating the decision rule, which is the only thing that could have prevented error 2.</w:t>
+        <w:t>Walk through what each element does. The highest-leverage single sentence is “ask me any questions you need before answering”: it converts the model from a guesser into an interviewer. The second is stating the decision rule, which is the only thing that could have prevented error 2.</w:t>
       </w:r>
     </w:p>
     <w:tbl>
@@ -4401,7 +4423,7 @@
           <w:sz w:val="21"/>
           <w:szCs w:val="21"/>
         </w:rPr>
-        <w:t xml:space="preserve">Screenshot it. Real captured failures go into the AI_failure_exs folder and get reused in later sessions — they are more persuasive than anything written in advance, because they carry the model’s actual voice.</w:t>
+        <w:t>Screenshot it. Real captured failures go into the AI_failure_exs folder and get reused in later sessions: they are more persuasive than anything written in advance, because they carry the model’s actual voice.</w:t>
       </w:r>
     </w:p>
     <w:p>
@@ -4512,7 +4534,7 @@
                 <w:sz w:val="21"/>
                 <w:szCs w:val="21"/>
               </w:rPr>
-              <w:t xml:space="preserve">When the data comes, check first whether the DOH evaluation has more than one pre-period. If it does, this section can show a real pre-trend check and complete the contrast with GreenWaste — which would make it the strongest part of the session rather than a repeat.</w:t>
+              <w:t>When the data comes, check first whether the DOH evaluation has more than one pre-period. If it does, this section can show a real pre-trend check and complete the contrast with GreenWaste, which would make it the strongest part of the session rather than a repeat.</w:t>
             </w:r>
           </w:p>
         </w:tc>
@@ -4579,7 +4601,7 @@
           <w:sz w:val="21"/>
           <w:szCs w:val="21"/>
         </w:rPr>
-        <w:t xml:space="preserve">“Which number is the difference-in-differences estimate?” — not the baseline gap, not the time trend. Make them point at the row.</w:t>
+        <w:t>“Why difference-in-differences here rather than another method, like a randomised trial?” A strong answer names what they could not do and what this design buys them; a weak one treats it as the only option.</w:t>
       </w:r>
     </w:p>
     <w:p>
@@ -4597,7 +4619,7 @@
           <w:sz w:val="21"/>
           <w:szCs w:val="21"/>
         </w:rPr>
-        <w:t xml:space="preserve">“Were the two groups already moving apart — and how do you know?” — if they cannot test it, ask what they offer instead.</w:t>
+        <w:t>“Were the two groups already moving apart, and how do you know?” If they cannot test it, ask what they offer instead.</w:t>
       </w:r>
     </w:p>
     <w:p>
@@ -4615,7 +4637,7 @@
           <w:sz w:val="21"/>
           <w:szCs w:val="21"/>
         </w:rPr>
-        <w:t xml:space="preserve">“Does this clear the bar we set — and what is the range?” — significant is not the same as sufficient.</w:t>
+        <w:t>“Does this clear the bar we set, and what is the range?” Significant is not the same as sufficient.</w:t>
       </w:r>
     </w:p>
     <w:p>
@@ -4628,7 +4650,7 @@
           <w:sz w:val="21"/>
           <w:szCs w:val="21"/>
         </w:rPr>
-        <w:t xml:space="preserve">Close on the scoreboard. Day 2 is one story told four ways, and the methods will not all agree — that tension is the afternoon’s reason to exist.</w:t>
+        <w:t>Close on the scoreboard. Day 2 is one story told four ways, and the methods will not all agree: that tension is the afternoon’s reason to exist.</w:t>
       </w:r>
     </w:p>
     <w:p>
@@ -4650,7 +4672,7 @@
           <w:sz w:val="30"/>
           <w:szCs w:val="30"/>
         </w:rPr>
-        <w:t xml:space="preserve">Handout 1 — the four numbers</w:t>
+        <w:t>Handout 1: the four numbers</w:t>
       </w:r>
     </w:p>
     <w:p>
@@ -5127,7 +5149,7 @@
           <w:sz w:val="30"/>
           <w:szCs w:val="30"/>
         </w:rPr>
-        <w:t xml:space="preserve">Handout 2 — what the AI said</w:t>
+        <w:t>Handout 2: what the AI said</w:t>
       </w:r>
     </w:p>
     <w:p>
@@ -5263,7 +5285,7 @@
           <w:sz w:val="30"/>
           <w:szCs w:val="30"/>
         </w:rPr>
-        <w:t xml:space="preserve">Handout 3 — the two prompts</w:t>
+        <w:t>Handout 3: the two prompts</w:t>
       </w:r>
     </w:p>
     <w:p>
@@ -5280,7 +5302,7 @@
           <w:sz w:val="21"/>
           <w:szCs w:val="21"/>
         </w:rPr>
-        <w:t xml:space="preserve">Prompt A — run this first</w:t>
+        <w:t>Prompt A: run this first</w:t>
       </w:r>
     </w:p>
     <w:tbl>
@@ -5342,7 +5364,7 @@
           <w:sz w:val="21"/>
           <w:szCs w:val="21"/>
         </w:rPr>
-        <w:t xml:space="preserve">Prompt B — then run this, on the same table</w:t>
+        <w:t>Prompt B: then run this, on the same table</w:t>
       </w:r>
     </w:p>
     <w:tbl>
@@ -5414,7 +5436,7 @@
                 <w:sz w:val="21"/>
                 <w:szCs w:val="21"/>
               </w:rPr>
-              <w:t xml:space="preserve">Then: (1) which single number is the estimated effect, and which are not; (2) does it meet our rule; (3) what would have to be true for me to believe it — and which of those I cannot verify from this table.</w:t>
+              <w:t>Then: (1) which single number is the estimated effect, and which are not; (2) does it meet our rule; (3) what would have to be true for me to believe it, and which of those I cannot verify from this table.</w:t>
             </w:r>
           </w:p>
         </w:tc>
@@ -5464,7 +5486,7 @@
           <w:sz w:val="30"/>
           <w:szCs w:val="30"/>
         </w:rPr>
-        <w:t xml:space="preserve">Handout 4 — three questions for any evaluator</w:t>
+        <w:t>Handout 4: three questions for any evaluator</w:t>
       </w:r>
     </w:p>
     <w:p>
@@ -5482,7 +5504,7 @@
           <w:sz w:val="21"/>
           <w:szCs w:val="21"/>
         </w:rPr>
-        <w:t xml:space="preserve">“Which number is the difference-in-differences estimate?”</w:t>
+        <w:t>“Why difference-in-differences here rather than another method, like a randomised trial?”</w:t>
       </w:r>
     </w:p>
     <w:p>
@@ -5500,7 +5522,7 @@
           <w:sz w:val="21"/>
           <w:szCs w:val="21"/>
         </w:rPr>
-        <w:t xml:space="preserve">“Were the two groups already moving apart before the programme started — and how do you know?”</w:t>
+        <w:t>“Were the two groups already moving apart before the programme started, and how do you know?”</w:t>
       </w:r>
     </w:p>
     <w:p>
@@ -5518,7 +5540,7 @@
           <w:sz w:val="21"/>
           <w:szCs w:val="21"/>
         </w:rPr>
-        <w:t xml:space="preserve">“Does this clear the bar we set for acting — and what is the range?”</w:t>
+        <w:t>“Does this clear the bar we set for acting, and what is the range?”</w:t>
       </w:r>
     </w:p>
     <w:p>

</xml_diff>